<commit_message>
Actualiza portafolio con nuevo perfil, experiencia y habilidades
</commit_message>
<xml_diff>
--- a/src/assets/CV_Rodrigo_Romero.docx
+++ b/src/assets/CV_Rodrigo_Romero.docx
@@ -162,18 +162,15 @@
           <w:szCs w:val="18"/>
         </w:rPr>
       </w:pPr>
-    </w:p>
-    <w:p>
-      <w:pPr>
-        <w:spacing w:after="0" w:line="240" w:lineRule="auto"/>
-        <w:jc w:val="both"/>
+      <w:r>
         <w:rPr>
           <w:rFonts w:eastAsia="Calibri" w:cstheme="minorHAnsi"/>
           <w:bCs/>
           <w:sz w:val="18"/>
           <w:szCs w:val="18"/>
         </w:rPr>
-      </w:pPr>
+        <w:t xml:space="preserve">Desarrollador de Software e Ingeniero en Computación e Informática con experiencia en desarrollo móvil y web en entornos productivos. Participé en proyectos corporativos para ENAMI desarrollando soluciones Android en Kotlin bajo arquitectura MVVM, integrando APIs REST y bases de datos locales. Además, cuento con experiencia en desarrollo web full stack utilizando React, Node.js y bases de datos relacionales y no relacionales. </w:t>
+      </w:r>
       <w:r>
         <w:rPr>
           <w:rFonts w:eastAsia="Calibri" w:cstheme="minorHAnsi"/>
@@ -181,20 +178,17 @@
           <w:sz w:val="18"/>
           <w:szCs w:val="18"/>
         </w:rPr>
-        <w:t>Estudiante de Ingeniería en Computación e Informática en la Universidad Andrés Bello. Durante mi formación he desarrollado interés en asignaturas relacionadas con desarrollo web, bases de datos y programación avanzada. Realicé mi práctica en el área de soporte TI, dentro del rubro de servicios tecnológicos.</w:t>
-      </w:r>
-    </w:p>
-    <w:p>
-      <w:pPr>
-        <w:spacing w:after="0" w:line="240" w:lineRule="auto"/>
-        <w:jc w:val="both"/>
+        <w:t>Interesado en</w:t>
+      </w:r>
+      <w:r>
         <w:rPr>
           <w:rFonts w:eastAsia="Calibri" w:cstheme="minorHAnsi"/>
           <w:bCs/>
           <w:sz w:val="18"/>
           <w:szCs w:val="18"/>
         </w:rPr>
-      </w:pPr>
+        <w:t xml:space="preserve"> participar en proyectos de desarrollo de software, arquitectura de sistemas y soluciones tecnológicas escalables</w:t>
+      </w:r>
       <w:r>
         <w:rPr>
           <w:rFonts w:eastAsia="Calibri" w:cstheme="minorHAnsi"/>
@@ -202,61 +196,7 @@
           <w:sz w:val="18"/>
           <w:szCs w:val="18"/>
         </w:rPr>
-        <w:t xml:space="preserve">Poseo competencias en resolución de problemas, trabajo colaborativo y adaptabilidad. Cuento con conocimientos en desarrollo full stack, bases de datos relacionales y no relacionales, y control de versiones con Git. Actualmente busco iniciar mi práctica profesional en el área de desarrollo de </w:t>
-      </w:r>
-      <w:r>
-        <w:rPr>
-          <w:rFonts w:eastAsia="Calibri" w:cstheme="minorHAnsi"/>
-          <w:bCs/>
-          <w:sz w:val="18"/>
-          <w:szCs w:val="18"/>
-        </w:rPr>
-        <w:t>software</w:t>
-      </w:r>
-      <w:r>
-        <w:rPr>
-          <w:rFonts w:eastAsia="Calibri" w:cstheme="minorHAnsi"/>
-          <w:bCs/>
-          <w:sz w:val="18"/>
-          <w:szCs w:val="18"/>
-        </w:rPr>
-        <w:t xml:space="preserve">, </w:t>
-      </w:r>
-      <w:r>
-        <w:rPr>
-          <w:rFonts w:eastAsia="Calibri" w:cstheme="minorHAnsi"/>
-          <w:bCs/>
-          <w:sz w:val="18"/>
-          <w:szCs w:val="18"/>
-        </w:rPr>
-        <w:t>ingeniería</w:t>
-      </w:r>
-      <w:r>
-        <w:rPr>
-          <w:rFonts w:eastAsia="Calibri" w:cstheme="minorHAnsi"/>
-          <w:bCs/>
-          <w:sz w:val="18"/>
-          <w:szCs w:val="18"/>
-        </w:rPr>
-        <w:t xml:space="preserve"> web</w:t>
-      </w:r>
-      <w:r>
-        <w:rPr>
-          <w:rFonts w:eastAsia="Calibri" w:cstheme="minorHAnsi"/>
-          <w:bCs/>
-          <w:sz w:val="18"/>
-          <w:szCs w:val="18"/>
-        </w:rPr>
-        <w:t xml:space="preserve"> o móvil.</w:t>
-      </w:r>
-      <w:r>
-        <w:rPr>
-          <w:rFonts w:eastAsia="Calibri" w:cstheme="minorHAnsi"/>
-          <w:bCs/>
-          <w:sz w:val="18"/>
-          <w:szCs w:val="18"/>
-        </w:rPr>
-        <w:t xml:space="preserve"> </w:t>
+        <w:t>.</w:t>
       </w:r>
     </w:p>
     <w:p>
@@ -294,6 +234,149 @@
         </w:rPr>
         <w:t xml:space="preserve">EXPERIENCIA PROFESIONAL </w:t>
       </w:r>
+    </w:p>
+    <w:p>
+      <w:pPr>
+        <w:pStyle w:val="Sinespaciado"/>
+        <w:jc w:val="both"/>
+        <w:rPr>
+          <w:rFonts w:cstheme="minorHAnsi"/>
+          <w:b/>
+          <w:bCs/>
+          <w:sz w:val="18"/>
+          <w:szCs w:val="18"/>
+        </w:rPr>
+      </w:pPr>
+      <w:r>
+        <w:rPr>
+          <w:rFonts w:cstheme="minorHAnsi"/>
+          <w:b/>
+          <w:bCs/>
+          <w:sz w:val="18"/>
+          <w:szCs w:val="18"/>
+        </w:rPr>
+        <w:t>DUHOVIT</w:t>
+      </w:r>
+    </w:p>
+    <w:p>
+      <w:pPr>
+        <w:pStyle w:val="Sinespaciado"/>
+        <w:jc w:val="both"/>
+        <w:rPr>
+          <w:rFonts w:cstheme="minorHAnsi"/>
+          <w:b/>
+          <w:bCs/>
+          <w:sz w:val="18"/>
+          <w:szCs w:val="18"/>
+        </w:rPr>
+      </w:pPr>
+      <w:r>
+        <w:rPr>
+          <w:rFonts w:cstheme="minorHAnsi"/>
+          <w:b/>
+          <w:bCs/>
+          <w:sz w:val="18"/>
+          <w:szCs w:val="18"/>
+        </w:rPr>
+        <w:t>Práctica Profesional – Desarrollo de Software (</w:t>
+      </w:r>
+      <w:r>
+        <w:rPr>
+          <w:rFonts w:cstheme="minorHAnsi"/>
+          <w:b/>
+          <w:bCs/>
+          <w:sz w:val="18"/>
+          <w:szCs w:val="18"/>
+        </w:rPr>
+        <w:t xml:space="preserve">diciembre </w:t>
+      </w:r>
+      <w:r>
+        <w:rPr>
+          <w:rFonts w:cstheme="minorHAnsi"/>
+          <w:b/>
+          <w:bCs/>
+          <w:sz w:val="18"/>
+          <w:szCs w:val="18"/>
+        </w:rPr>
+        <w:t>2025</w:t>
+      </w:r>
+      <w:r>
+        <w:rPr>
+          <w:rFonts w:cstheme="minorHAnsi"/>
+          <w:b/>
+          <w:bCs/>
+          <w:sz w:val="18"/>
+          <w:szCs w:val="18"/>
+        </w:rPr>
+        <w:t xml:space="preserve"> – febrero 2026</w:t>
+      </w:r>
+      <w:r>
+        <w:rPr>
+          <w:rFonts w:cstheme="minorHAnsi"/>
+          <w:b/>
+          <w:bCs/>
+          <w:sz w:val="18"/>
+          <w:szCs w:val="18"/>
+        </w:rPr>
+        <w:t>)</w:t>
+      </w:r>
+    </w:p>
+    <w:p>
+      <w:pPr>
+        <w:pStyle w:val="Sinespaciado"/>
+        <w:jc w:val="both"/>
+        <w:rPr>
+          <w:rFonts w:cstheme="minorHAnsi"/>
+          <w:b/>
+          <w:bCs/>
+          <w:sz w:val="18"/>
+          <w:szCs w:val="18"/>
+        </w:rPr>
+      </w:pPr>
+    </w:p>
+    <w:p>
+      <w:pPr>
+        <w:pStyle w:val="Sinespaciado"/>
+        <w:numPr>
+          <w:ilvl w:val="0"/>
+          <w:numId w:val="18"/>
+        </w:numPr>
+        <w:jc w:val="both"/>
+        <w:rPr>
+          <w:rFonts w:cstheme="minorHAnsi"/>
+          <w:sz w:val="18"/>
+          <w:szCs w:val="18"/>
+        </w:rPr>
+      </w:pPr>
+      <w:r>
+        <w:rPr>
+          <w:rFonts w:cstheme="minorHAnsi"/>
+          <w:sz w:val="18"/>
+          <w:szCs w:val="18"/>
+        </w:rPr>
+        <w:t>Integrante del equipo de desarrollo en proyecto para ENAMI, trabajando con Kotlin bajo arquitectura MVVM. Integré APIs REST con Retrofit y persistencia local con Room (SQLite), fortaleciendo el enfoque offline-first. Implementé nuevas funcionalidades y trabajé bajo GitFlow en coordinación con backend</w:t>
+      </w:r>
+      <w:r>
+        <w:rPr>
+          <w:rFonts w:cstheme="minorHAnsi"/>
+          <w:sz w:val="18"/>
+          <w:szCs w:val="18"/>
+        </w:rPr>
+        <w:t>.</w:t>
+      </w:r>
+    </w:p>
+    <w:p>
+      <w:pPr>
+        <w:pStyle w:val="Sinespaciado"/>
+        <w:jc w:val="both"/>
+        <w:rPr>
+          <w:rFonts w:cstheme="minorHAnsi"/>
+          <w:b/>
+          <w:bCs/>
+          <w:sz w:val="18"/>
+          <w:szCs w:val="18"/>
+        </w:rPr>
+      </w:pPr>
     </w:p>
     <w:p>
       <w:pPr>
@@ -414,7 +497,15 @@
           <w:sz w:val="18"/>
           <w:szCs w:val="18"/>
         </w:rPr>
-        <w:t>Responsable de brindar soporte técnico y apoyo operativo al área de marketing y capacitación, asegurando el funcionamiento de las plataformas digitales y la gestión eficiente de procesos internos. Desarrollé tareas de programación de correos masivos, administración de Moodle y Zoom, actualización de bases de datos y elaboración de protocolos de gestión. Logré mejorar la coordinación entre áreas y optimizar el uso de herramientas digitales en la empresa.</w:t>
+        <w:t>Soporte técnico y apoyo operativo al área de marketing y capacitación. Administración de Moodle y Zoom, gestión de bases de datos y automatización de correos masivos, optimizando procesos internos</w:t>
+      </w:r>
+      <w:r>
+        <w:rPr>
+          <w:rFonts w:cstheme="minorHAnsi"/>
+          <w:sz w:val="18"/>
+          <w:szCs w:val="18"/>
+        </w:rPr>
+        <w:t>.</w:t>
       </w:r>
     </w:p>
     <w:p>
@@ -468,6 +559,16 @@
           <w:szCs w:val="18"/>
         </w:rPr>
       </w:pPr>
+      <w:r>
+        <w:rPr>
+          <w:rFonts w:cstheme="minorHAnsi"/>
+          <w:b/>
+          <w:bCs/>
+          <w:sz w:val="18"/>
+          <w:szCs w:val="18"/>
+        </w:rPr>
+        <w:t>UNIVERSIDAD ANDRÉS BELLO</w:t>
+      </w:r>
     </w:p>
     <w:p>
       <w:pPr>
@@ -475,40 +576,33 @@
         <w:jc w:val="both"/>
         <w:rPr>
           <w:rFonts w:cstheme="minorHAnsi"/>
-          <w:b/>
-          <w:bCs/>
-          <w:sz w:val="18"/>
-          <w:szCs w:val="18"/>
-        </w:rPr>
-      </w:pPr>
-      <w:r>
-        <w:rPr>
-          <w:rFonts w:cstheme="minorHAnsi"/>
-          <w:b/>
-          <w:bCs/>
-          <w:sz w:val="18"/>
-          <w:szCs w:val="18"/>
-        </w:rPr>
-        <w:t>UNIVERSIDAD ANDRÉS BELLO</w:t>
-      </w:r>
-    </w:p>
-    <w:p>
-      <w:pPr>
-        <w:pStyle w:val="Sinespaciado"/>
-        <w:jc w:val="both"/>
-        <w:rPr>
-          <w:rFonts w:cstheme="minorHAnsi"/>
-          <w:sz w:val="18"/>
-          <w:szCs w:val="18"/>
-        </w:rPr>
-      </w:pPr>
-      <w:r>
-        <w:rPr>
-          <w:rFonts w:cstheme="minorHAnsi"/>
-          <w:sz w:val="18"/>
-          <w:szCs w:val="18"/>
-        </w:rPr>
-        <w:t>Ingeniería en Computación e Informática (2022 – Actualidad)</w:t>
+          <w:sz w:val="18"/>
+          <w:szCs w:val="18"/>
+        </w:rPr>
+      </w:pPr>
+      <w:r>
+        <w:rPr>
+          <w:rFonts w:cstheme="minorHAnsi"/>
+          <w:sz w:val="18"/>
+          <w:szCs w:val="18"/>
+        </w:rPr>
+        <w:t>Ingeniería en Computación e Informática</w:t>
+      </w:r>
+      <w:r>
+        <w:rPr>
+          <w:rFonts w:cstheme="minorHAnsi"/>
+          <w:sz w:val="18"/>
+          <w:szCs w:val="18"/>
+        </w:rPr>
+        <w:t xml:space="preserve"> </w:t>
+      </w:r>
+      <w:r>
+        <w:rPr>
+          <w:rFonts w:cstheme="minorHAnsi"/>
+          <w:sz w:val="18"/>
+          <w:szCs w:val="18"/>
+        </w:rPr>
+        <w:t>(2022–2026)</w:t>
       </w:r>
     </w:p>
     <w:p>
@@ -686,66 +780,48 @@
     <w:p>
       <w:pPr>
         <w:pStyle w:val="Sinespaciado"/>
+        <w:numPr>
+          <w:ilvl w:val="0"/>
+          <w:numId w:val="16"/>
+        </w:numPr>
         <w:jc w:val="both"/>
         <w:rPr>
           <w:rFonts w:cstheme="minorHAnsi"/>
-          <w:b/>
-          <w:bCs/>
-          <w:sz w:val="18"/>
-          <w:szCs w:val="18"/>
-        </w:rPr>
-      </w:pPr>
-      <w:r>
-        <w:rPr>
-          <w:rFonts w:cstheme="minorHAnsi"/>
-          <w:b/>
-          <w:bCs/>
-          <w:sz w:val="18"/>
-          <w:szCs w:val="18"/>
-        </w:rPr>
-        <w:t>Idiomas:</w:t>
-      </w:r>
-    </w:p>
-    <w:p>
-      <w:pPr>
-        <w:pStyle w:val="Sinespaciado"/>
-        <w:jc w:val="both"/>
-        <w:rPr>
-          <w:rFonts w:cstheme="minorHAnsi"/>
-          <w:sz w:val="18"/>
-          <w:szCs w:val="18"/>
-        </w:rPr>
-      </w:pPr>
-      <w:r>
-        <w:rPr>
-          <w:rFonts w:cstheme="minorHAnsi"/>
-          <w:sz w:val="18"/>
-          <w:szCs w:val="18"/>
-        </w:rPr>
-        <w:t>Inglés nivel B1 (lectura y comprensión intermedia, conversación funcional).</w:t>
-      </w:r>
-    </w:p>
-    <w:p>
-      <w:pPr>
-        <w:pStyle w:val="Sinespaciado"/>
-        <w:jc w:val="both"/>
-        <w:rPr>
-          <w:rFonts w:cstheme="minorHAnsi"/>
-          <w:b/>
-          <w:bCs/>
-          <w:sz w:val="18"/>
-          <w:szCs w:val="18"/>
-        </w:rPr>
-      </w:pPr>
-      <w:r>
-        <w:rPr>
-          <w:rFonts w:cstheme="minorHAnsi"/>
-          <w:b/>
-          <w:bCs/>
-          <w:sz w:val="18"/>
-          <w:szCs w:val="18"/>
-        </w:rPr>
-        <w:t>Herramientas tecnológicas:</w:t>
+          <w:sz w:val="18"/>
+          <w:szCs w:val="18"/>
+        </w:rPr>
+      </w:pPr>
+      <w:r>
+        <w:rPr>
+          <w:rFonts w:cstheme="minorHAnsi"/>
+          <w:sz w:val="18"/>
+          <w:szCs w:val="18"/>
+        </w:rPr>
+        <w:t>Lenguajes: JavaScript, Python, C</w:t>
+      </w:r>
+      <w:r>
+        <w:rPr>
+          <w:rFonts w:cstheme="minorHAnsi"/>
+          <w:sz w:val="18"/>
+          <w:szCs w:val="18"/>
+        </w:rPr>
+        <w:t xml:space="preserve">, </w:t>
+      </w:r>
+      <w:r>
+        <w:rPr>
+          <w:rFonts w:cstheme="minorHAnsi"/>
+          <w:sz w:val="18"/>
+          <w:szCs w:val="18"/>
+        </w:rPr>
+        <w:t>Kotlin</w:t>
+      </w:r>
+      <w:r>
+        <w:rPr>
+          <w:rFonts w:cstheme="minorHAnsi"/>
+          <w:sz w:val="18"/>
+          <w:szCs w:val="18"/>
+        </w:rPr>
+        <w:t>.</w:t>
       </w:r>
     </w:p>
     <w:p>
@@ -768,7 +844,7 @@
           <w:sz w:val="18"/>
           <w:szCs w:val="18"/>
         </w:rPr>
-        <w:t>Lenguajes: JavaScript, Python, C.</w:t>
+        <w:t>Frontend: React, HTML, CSS, TailwindCSS.</w:t>
       </w:r>
     </w:p>
     <w:p>
@@ -791,7 +867,7 @@
           <w:sz w:val="18"/>
           <w:szCs w:val="18"/>
         </w:rPr>
-        <w:t>Frontend: React, HTML, CSS, TailwindCSS.</w:t>
+        <w:t>Backend: Node.js, REST API, JWT.</w:t>
       </w:r>
     </w:p>
     <w:p>
@@ -814,7 +890,7 @@
           <w:sz w:val="18"/>
           <w:szCs w:val="18"/>
         </w:rPr>
-        <w:t>Backend: Node.js, REST API, JWT.</w:t>
+        <w:t>Mobile: Android, MVVM, Room, Retrofit.</w:t>
       </w:r>
     </w:p>
     <w:p>
@@ -837,7 +913,31 @@
           <w:sz w:val="18"/>
           <w:szCs w:val="18"/>
         </w:rPr>
-        <w:t>Bases de datos: PostgreSQL, MongoDB.</w:t>
+        <w:t>Bases de datos: PostgreSQL, MongoDB, SQLite</w:t>
+      </w:r>
+      <w:r>
+        <w:rPr>
+          <w:rFonts w:cstheme="minorHAnsi"/>
+          <w:sz w:val="18"/>
+          <w:szCs w:val="18"/>
+        </w:rPr>
+        <w:t xml:space="preserve">, </w:t>
+      </w:r>
+      <w:r>
+        <w:rPr>
+          <w:rFonts w:cstheme="minorHAnsi"/>
+          <w:sz w:val="18"/>
+          <w:szCs w:val="18"/>
+        </w:rPr>
+        <w:t>SQL Server</w:t>
+      </w:r>
+      <w:r>
+        <w:rPr>
+          <w:rFonts w:cstheme="minorHAnsi"/>
+          <w:sz w:val="18"/>
+          <w:szCs w:val="18"/>
+        </w:rPr>
+        <w:t>.</w:t>
       </w:r>
     </w:p>
     <w:p>
@@ -860,7 +960,15 @@
           <w:sz w:val="18"/>
           <w:szCs w:val="18"/>
         </w:rPr>
-        <w:t>Control de versiones: Git / GitHub.</w:t>
+        <w:t xml:space="preserve">Control de versiones: </w:t>
+      </w:r>
+      <w:r>
+        <w:rPr>
+          <w:rFonts w:cstheme="minorHAnsi"/>
+          <w:sz w:val="18"/>
+          <w:szCs w:val="18"/>
+        </w:rPr>
+        <w:t>Git (GitHub y GitLab) – GitFlow</w:t>
       </w:r>
     </w:p>
     <w:p>
@@ -917,6 +1025,56 @@
         </w:rPr>
         <w:t>.</w:t>
       </w:r>
+    </w:p>
+    <w:p>
+      <w:pPr>
+        <w:pStyle w:val="Sinespaciado"/>
+        <w:numPr>
+          <w:ilvl w:val="0"/>
+          <w:numId w:val="16"/>
+        </w:numPr>
+        <w:jc w:val="both"/>
+        <w:rPr>
+          <w:rFonts w:cstheme="minorHAnsi"/>
+          <w:sz w:val="18"/>
+          <w:szCs w:val="18"/>
+        </w:rPr>
+      </w:pPr>
+      <w:r>
+        <w:rPr>
+          <w:rFonts w:cstheme="minorHAnsi"/>
+          <w:sz w:val="18"/>
+          <w:szCs w:val="18"/>
+        </w:rPr>
+        <w:t>Inglés</w:t>
+      </w:r>
+      <w:r>
+        <w:rPr>
+          <w:rFonts w:cstheme="minorHAnsi"/>
+          <w:sz w:val="18"/>
+          <w:szCs w:val="18"/>
+        </w:rPr>
+        <w:t>:</w:t>
+      </w:r>
+      <w:r>
+        <w:rPr>
+          <w:rFonts w:cstheme="minorHAnsi"/>
+          <w:sz w:val="18"/>
+          <w:szCs w:val="18"/>
+        </w:rPr>
+        <w:t xml:space="preserve"> nivel B1 (lectura y comprensión intermedia, conversación funcional).</w:t>
+      </w:r>
+    </w:p>
+    <w:p>
+      <w:pPr>
+        <w:pStyle w:val="Sinespaciado"/>
+        <w:jc w:val="both"/>
+        <w:rPr>
+          <w:rFonts w:cstheme="minorHAnsi"/>
+          <w:sz w:val="18"/>
+          <w:szCs w:val="18"/>
+        </w:rPr>
+      </w:pPr>
     </w:p>
     <w:p>
       <w:pPr>
@@ -2757,6 +2915,119 @@
     </w:lvl>
   </w:abstractNum>
   <w:abstractNum w:abstractNumId="14" w15:restartNumberingAfterBreak="0">
+    <w:nsid w:val="6E9B74B4"/>
+    <w:multiLevelType w:val="hybridMultilevel"/>
+    <w:tmpl w:val="C1D23390"/>
+    <w:lvl w:ilvl="0" w:tplc="340A0001">
+      <w:start w:val="1"/>
+      <w:numFmt w:val="bullet"/>
+      <w:lvlText w:val=""/>
+      <w:lvlJc w:val="left"/>
+      <w:pPr>
+        <w:ind w:left="720" w:hanging="360"/>
+      </w:pPr>
+      <w:rPr>
+        <w:rFonts w:ascii="Symbol" w:hAnsi="Symbol" w:hint="default"/>
+      </w:rPr>
+    </w:lvl>
+    <w:lvl w:ilvl="1" w:tplc="340A0003" w:tentative="1">
+      <w:start w:val="1"/>
+      <w:numFmt w:val="bullet"/>
+      <w:lvlText w:val="o"/>
+      <w:lvlJc w:val="left"/>
+      <w:pPr>
+        <w:ind w:left="1440" w:hanging="360"/>
+      </w:pPr>
+      <w:rPr>
+        <w:rFonts w:ascii="Courier New" w:hAnsi="Courier New" w:cs="Courier New" w:hint="default"/>
+      </w:rPr>
+    </w:lvl>
+    <w:lvl w:ilvl="2" w:tplc="340A0005" w:tentative="1">
+      <w:start w:val="1"/>
+      <w:numFmt w:val="bullet"/>
+      <w:lvlText w:val=""/>
+      <w:lvlJc w:val="left"/>
+      <w:pPr>
+        <w:ind w:left="2160" w:hanging="360"/>
+      </w:pPr>
+      <w:rPr>
+        <w:rFonts w:ascii="Wingdings" w:hAnsi="Wingdings" w:hint="default"/>
+      </w:rPr>
+    </w:lvl>
+    <w:lvl w:ilvl="3" w:tplc="340A0001" w:tentative="1">
+      <w:start w:val="1"/>
+      <w:numFmt w:val="bullet"/>
+      <w:lvlText w:val=""/>
+      <w:lvlJc w:val="left"/>
+      <w:pPr>
+        <w:ind w:left="2880" w:hanging="360"/>
+      </w:pPr>
+      <w:rPr>
+        <w:rFonts w:ascii="Symbol" w:hAnsi="Symbol" w:hint="default"/>
+      </w:rPr>
+    </w:lvl>
+    <w:lvl w:ilvl="4" w:tplc="340A0003" w:tentative="1">
+      <w:start w:val="1"/>
+      <w:numFmt w:val="bullet"/>
+      <w:lvlText w:val="o"/>
+      <w:lvlJc w:val="left"/>
+      <w:pPr>
+        <w:ind w:left="3600" w:hanging="360"/>
+      </w:pPr>
+      <w:rPr>
+        <w:rFonts w:ascii="Courier New" w:hAnsi="Courier New" w:cs="Courier New" w:hint="default"/>
+      </w:rPr>
+    </w:lvl>
+    <w:lvl w:ilvl="5" w:tplc="340A0005" w:tentative="1">
+      <w:start w:val="1"/>
+      <w:numFmt w:val="bullet"/>
+      <w:lvlText w:val=""/>
+      <w:lvlJc w:val="left"/>
+      <w:pPr>
+        <w:ind w:left="4320" w:hanging="360"/>
+      </w:pPr>
+      <w:rPr>
+        <w:rFonts w:ascii="Wingdings" w:hAnsi="Wingdings" w:hint="default"/>
+      </w:rPr>
+    </w:lvl>
+    <w:lvl w:ilvl="6" w:tplc="340A0001" w:tentative="1">
+      <w:start w:val="1"/>
+      <w:numFmt w:val="bullet"/>
+      <w:lvlText w:val=""/>
+      <w:lvlJc w:val="left"/>
+      <w:pPr>
+        <w:ind w:left="5040" w:hanging="360"/>
+      </w:pPr>
+      <w:rPr>
+        <w:rFonts w:ascii="Symbol" w:hAnsi="Symbol" w:hint="default"/>
+      </w:rPr>
+    </w:lvl>
+    <w:lvl w:ilvl="7" w:tplc="340A0003" w:tentative="1">
+      <w:start w:val="1"/>
+      <w:numFmt w:val="bullet"/>
+      <w:lvlText w:val="o"/>
+      <w:lvlJc w:val="left"/>
+      <w:pPr>
+        <w:ind w:left="5760" w:hanging="360"/>
+      </w:pPr>
+      <w:rPr>
+        <w:rFonts w:ascii="Courier New" w:hAnsi="Courier New" w:cs="Courier New" w:hint="default"/>
+      </w:rPr>
+    </w:lvl>
+    <w:lvl w:ilvl="8" w:tplc="340A0005" w:tentative="1">
+      <w:start w:val="1"/>
+      <w:numFmt w:val="bullet"/>
+      <w:lvlText w:val=""/>
+      <w:lvlJc w:val="left"/>
+      <w:pPr>
+        <w:ind w:left="6480" w:hanging="360"/>
+      </w:pPr>
+      <w:rPr>
+        <w:rFonts w:ascii="Wingdings" w:hAnsi="Wingdings" w:hint="default"/>
+      </w:rPr>
+    </w:lvl>
+  </w:abstractNum>
+  <w:abstractNum w:abstractNumId="15" w15:restartNumberingAfterBreak="0">
     <w:nsid w:val="752155A0"/>
     <w:multiLevelType w:val="hybridMultilevel"/>
     <w:tmpl w:val="3C4E105E"/>
@@ -2869,7 +3140,7 @@
       </w:rPr>
     </w:lvl>
   </w:abstractNum>
-  <w:abstractNum w:abstractNumId="15" w15:restartNumberingAfterBreak="0">
+  <w:abstractNum w:abstractNumId="16" w15:restartNumberingAfterBreak="0">
     <w:nsid w:val="7648711D"/>
     <w:multiLevelType w:val="hybridMultilevel"/>
     <w:tmpl w:val="585AEE52"/>
@@ -2982,7 +3253,7 @@
       </w:rPr>
     </w:lvl>
   </w:abstractNum>
-  <w:abstractNum w:abstractNumId="16" w15:restartNumberingAfterBreak="0">
+  <w:abstractNum w:abstractNumId="17" w15:restartNumberingAfterBreak="0">
     <w:nsid w:val="7C8C5753"/>
     <w:multiLevelType w:val="hybridMultilevel"/>
     <w:tmpl w:val="18A822C8"/>
@@ -3107,7 +3378,7 @@
     <w:abstractNumId w:val="11"/>
   </w:num>
   <w:num w:numId="5" w16cid:durableId="2057965786">
-    <w:abstractNumId w:val="16"/>
+    <w:abstractNumId w:val="17"/>
   </w:num>
   <w:num w:numId="6" w16cid:durableId="376707285">
     <w:abstractNumId w:val="2"/>
@@ -3122,7 +3393,7 @@
     <w:abstractNumId w:val="8"/>
   </w:num>
   <w:num w:numId="10" w16cid:durableId="444929828">
-    <w:abstractNumId w:val="14"/>
+    <w:abstractNumId w:val="15"/>
   </w:num>
   <w:num w:numId="11" w16cid:durableId="1690519893">
     <w:abstractNumId w:val="10"/>
@@ -3140,10 +3411,13 @@
     <w:abstractNumId w:val="6"/>
   </w:num>
   <w:num w:numId="16" w16cid:durableId="990596654">
-    <w:abstractNumId w:val="15"/>
+    <w:abstractNumId w:val="16"/>
   </w:num>
   <w:num w:numId="17" w16cid:durableId="1410538227">
     <w:abstractNumId w:val="3"/>
+  </w:num>
+  <w:num w:numId="18" w16cid:durableId="1341616935">
+    <w:abstractNumId w:val="14"/>
   </w:num>
 </w:numbering>
 </file>
@@ -3555,6 +3829,7 @@
   <w:style w:type="character" w:default="1" w:styleId="Fuentedeprrafopredeter">
     <w:name w:val="Default Paragraph Font"/>
     <w:uiPriority w:val="1"/>
+    <w:semiHidden/>
     <w:unhideWhenUsed/>
   </w:style>
   <w:style w:type="table" w:default="1" w:styleId="Tablanormal">

</xml_diff>

<commit_message>
Actualización de portafolio con nuevo CV, foto y descripción
</commit_message>
<xml_diff>
--- a/src/assets/CV_Rodrigo_Romero.docx
+++ b/src/assets/CV_Rodrigo_Romero.docx
@@ -169,8 +169,9 @@
           <w:sz w:val="18"/>
           <w:szCs w:val="18"/>
         </w:rPr>
-        <w:t xml:space="preserve">Desarrollador de Software e Ingeniero en Computación e Informática con experiencia en desarrollo móvil y web en entornos productivos. Participé en proyectos corporativos para ENAMI desarrollando soluciones Android en Kotlin bajo arquitectura MVVM, integrando APIs REST y bases de datos locales. Además, cuento con experiencia en desarrollo web full stack utilizando React, Node.js y bases de datos relacionales y no relacionales. </w:t>
-      </w:r>
+        <w:t xml:space="preserve">Desarrollador de Software e Ingeniero en Computación e Informática orientado al desarrollo </w:t>
+      </w:r>
+      <w:proofErr w:type="spellStart"/>
       <w:r>
         <w:rPr>
           <w:rFonts w:eastAsia="Calibri" w:cstheme="minorHAnsi"/>
@@ -178,8 +179,9 @@
           <w:sz w:val="18"/>
           <w:szCs w:val="18"/>
         </w:rPr>
-        <w:t>Interesado en</w:t>
-      </w:r>
+        <w:t>backend</w:t>
+      </w:r>
+      <w:proofErr w:type="spellEnd"/>
       <w:r>
         <w:rPr>
           <w:rFonts w:eastAsia="Calibri" w:cstheme="minorHAnsi"/>
@@ -187,8 +189,9 @@
           <w:sz w:val="18"/>
           <w:szCs w:val="18"/>
         </w:rPr>
-        <w:t xml:space="preserve"> participar en proyectos de desarrollo de software, arquitectura de sistemas y soluciones tecnológicas escalables</w:t>
-      </w:r>
+        <w:t xml:space="preserve"> y full </w:t>
+      </w:r>
+      <w:proofErr w:type="spellStart"/>
       <w:r>
         <w:rPr>
           <w:rFonts w:eastAsia="Calibri" w:cstheme="minorHAnsi"/>
@@ -196,7 +199,93 @@
           <w:sz w:val="18"/>
           <w:szCs w:val="18"/>
         </w:rPr>
-        <w:t>.</w:t>
+        <w:t>stack</w:t>
+      </w:r>
+      <w:proofErr w:type="spellEnd"/>
+      <w:r>
+        <w:rPr>
+          <w:rFonts w:eastAsia="Calibri" w:cstheme="minorHAnsi"/>
+          <w:bCs/>
+          <w:sz w:val="18"/>
+          <w:szCs w:val="18"/>
+        </w:rPr>
+        <w:t xml:space="preserve">. Cuento con experiencia en desarrollo de </w:t>
+      </w:r>
+      <w:proofErr w:type="spellStart"/>
+      <w:r>
+        <w:rPr>
+          <w:rFonts w:eastAsia="Calibri" w:cstheme="minorHAnsi"/>
+          <w:bCs/>
+          <w:sz w:val="18"/>
+          <w:szCs w:val="18"/>
+        </w:rPr>
+        <w:t>APIs</w:t>
+      </w:r>
+      <w:proofErr w:type="spellEnd"/>
+      <w:r>
+        <w:rPr>
+          <w:rFonts w:eastAsia="Calibri" w:cstheme="minorHAnsi"/>
+          <w:bCs/>
+          <w:sz w:val="18"/>
+          <w:szCs w:val="18"/>
+        </w:rPr>
+        <w:t xml:space="preserve"> REST, manejo de bases de datos relacionales y no relacionales, e integración de sistemas.</w:t>
+      </w:r>
+      <w:r>
+        <w:rPr>
+          <w:rFonts w:eastAsia="Calibri" w:cstheme="minorHAnsi"/>
+          <w:bCs/>
+          <w:sz w:val="18"/>
+          <w:szCs w:val="18"/>
+        </w:rPr>
+        <w:t xml:space="preserve"> </w:t>
+      </w:r>
+      <w:r>
+        <w:rPr>
+          <w:rFonts w:eastAsia="Calibri" w:cstheme="minorHAnsi"/>
+          <w:bCs/>
+          <w:sz w:val="18"/>
+          <w:szCs w:val="18"/>
+        </w:rPr>
+        <w:t xml:space="preserve">He participado en proyectos de desarrollo web y móvil en entornos productivos, trabajando con tecnologías como Node.js, </w:t>
+      </w:r>
+      <w:proofErr w:type="spellStart"/>
+      <w:r>
+        <w:rPr>
+          <w:rFonts w:eastAsia="Calibri" w:cstheme="minorHAnsi"/>
+          <w:bCs/>
+          <w:sz w:val="18"/>
+          <w:szCs w:val="18"/>
+        </w:rPr>
+        <w:t>React</w:t>
+      </w:r>
+      <w:proofErr w:type="spellEnd"/>
+      <w:r>
+        <w:rPr>
+          <w:rFonts w:eastAsia="Calibri" w:cstheme="minorHAnsi"/>
+          <w:bCs/>
+          <w:sz w:val="18"/>
+          <w:szCs w:val="18"/>
+        </w:rPr>
+        <w:t xml:space="preserve"> y bases de datos como PostgreSQL y MongoDB. Me interesa desarrollarme como </w:t>
+      </w:r>
+      <w:r>
+        <w:rPr>
+          <w:rFonts w:eastAsia="Calibri" w:cstheme="minorHAnsi"/>
+          <w:bCs/>
+          <w:sz w:val="18"/>
+          <w:szCs w:val="18"/>
+        </w:rPr>
+        <w:t>Ingeniero de Software</w:t>
+      </w:r>
+      <w:r>
+        <w:rPr>
+          <w:rFonts w:eastAsia="Calibri" w:cstheme="minorHAnsi"/>
+          <w:bCs/>
+          <w:sz w:val="18"/>
+          <w:szCs w:val="18"/>
+        </w:rPr>
+        <w:t>, participando en la construcción de sistemas escalables, eficientes y con impacto real.</w:t>
       </w:r>
     </w:p>
     <w:p>
@@ -354,8 +443,108 @@
           <w:sz w:val="18"/>
           <w:szCs w:val="18"/>
         </w:rPr>
-        <w:t>Integrante del equipo de desarrollo en proyecto para ENAMI, trabajando con Kotlin bajo arquitectura MVVM. Integré APIs REST con Retrofit y persistencia local con Room (SQLite), fortaleciendo el enfoque offline-first. Implementé nuevas funcionalidades y trabajé bajo GitFlow en coordinación con backend</w:t>
-      </w:r>
+        <w:t xml:space="preserve">Integrante del equipo de desarrollo en proyecto para ENAMI, trabajando con </w:t>
+      </w:r>
+      <w:proofErr w:type="spellStart"/>
+      <w:r>
+        <w:rPr>
+          <w:rFonts w:cstheme="minorHAnsi"/>
+          <w:sz w:val="18"/>
+          <w:szCs w:val="18"/>
+        </w:rPr>
+        <w:t>Kotlin</w:t>
+      </w:r>
+      <w:proofErr w:type="spellEnd"/>
+      <w:r>
+        <w:rPr>
+          <w:rFonts w:cstheme="minorHAnsi"/>
+          <w:sz w:val="18"/>
+          <w:szCs w:val="18"/>
+        </w:rPr>
+        <w:t xml:space="preserve"> bajo arquitectura MVVM. Integré </w:t>
+      </w:r>
+      <w:proofErr w:type="spellStart"/>
+      <w:r>
+        <w:rPr>
+          <w:rFonts w:cstheme="minorHAnsi"/>
+          <w:sz w:val="18"/>
+          <w:szCs w:val="18"/>
+        </w:rPr>
+        <w:t>APIs</w:t>
+      </w:r>
+      <w:proofErr w:type="spellEnd"/>
+      <w:r>
+        <w:rPr>
+          <w:rFonts w:cstheme="minorHAnsi"/>
+          <w:sz w:val="18"/>
+          <w:szCs w:val="18"/>
+        </w:rPr>
+        <w:t xml:space="preserve"> REST con </w:t>
+      </w:r>
+      <w:proofErr w:type="spellStart"/>
+      <w:r>
+        <w:rPr>
+          <w:rFonts w:cstheme="minorHAnsi"/>
+          <w:sz w:val="18"/>
+          <w:szCs w:val="18"/>
+        </w:rPr>
+        <w:t>Retrofit</w:t>
+      </w:r>
+      <w:proofErr w:type="spellEnd"/>
+      <w:r>
+        <w:rPr>
+          <w:rFonts w:cstheme="minorHAnsi"/>
+          <w:sz w:val="18"/>
+          <w:szCs w:val="18"/>
+        </w:rPr>
+        <w:t xml:space="preserve"> y persistencia local con Room (SQLite), fortaleciendo el enfoque offline-</w:t>
+      </w:r>
+      <w:proofErr w:type="spellStart"/>
+      <w:r>
+        <w:rPr>
+          <w:rFonts w:cstheme="minorHAnsi"/>
+          <w:sz w:val="18"/>
+          <w:szCs w:val="18"/>
+        </w:rPr>
+        <w:t>first</w:t>
+      </w:r>
+      <w:proofErr w:type="spellEnd"/>
+      <w:r>
+        <w:rPr>
+          <w:rFonts w:cstheme="minorHAnsi"/>
+          <w:sz w:val="18"/>
+          <w:szCs w:val="18"/>
+        </w:rPr>
+        <w:t xml:space="preserve">. Implementé nuevas funcionalidades y trabajé bajo </w:t>
+      </w:r>
+      <w:proofErr w:type="spellStart"/>
+      <w:r>
+        <w:rPr>
+          <w:rFonts w:cstheme="minorHAnsi"/>
+          <w:sz w:val="18"/>
+          <w:szCs w:val="18"/>
+        </w:rPr>
+        <w:t>GitFlow</w:t>
+      </w:r>
+      <w:proofErr w:type="spellEnd"/>
+      <w:r>
+        <w:rPr>
+          <w:rFonts w:cstheme="minorHAnsi"/>
+          <w:sz w:val="18"/>
+          <w:szCs w:val="18"/>
+        </w:rPr>
+        <w:t xml:space="preserve"> en coordinación con </w:t>
+      </w:r>
+      <w:proofErr w:type="spellStart"/>
+      <w:r>
+        <w:rPr>
+          <w:rFonts w:cstheme="minorHAnsi"/>
+          <w:sz w:val="18"/>
+          <w:szCs w:val="18"/>
+        </w:rPr>
+        <w:t>backend</w:t>
+      </w:r>
+      <w:proofErr w:type="spellEnd"/>
       <w:r>
         <w:rPr>
           <w:rFonts w:cstheme="minorHAnsi"/>
@@ -497,7 +686,25 @@
           <w:sz w:val="18"/>
           <w:szCs w:val="18"/>
         </w:rPr>
-        <w:t>Soporte técnico y apoyo operativo al área de marketing y capacitación. Administración de Moodle y Zoom, gestión de bases de datos y automatización de correos masivos, optimizando procesos internos</w:t>
+        <w:t xml:space="preserve">Soporte técnico y apoyo operativo al área de marketing y capacitación. Administración de Moodle y </w:t>
+      </w:r>
+      <w:proofErr w:type="gramStart"/>
+      <w:r>
+        <w:rPr>
+          <w:rFonts w:cstheme="minorHAnsi"/>
+          <w:sz w:val="18"/>
+          <w:szCs w:val="18"/>
+        </w:rPr>
+        <w:t>Zoom</w:t>
+      </w:r>
+      <w:proofErr w:type="gramEnd"/>
+      <w:r>
+        <w:rPr>
+          <w:rFonts w:cstheme="minorHAnsi"/>
+          <w:sz w:val="18"/>
+          <w:szCs w:val="18"/>
+        </w:rPr>
+        <w:t>, gestión de bases de datos y automatización de correos masivos, optimizando procesos internos</w:t>
       </w:r>
       <w:r>
         <w:rPr>
@@ -586,23 +793,7 @@
           <w:sz w:val="18"/>
           <w:szCs w:val="18"/>
         </w:rPr>
-        <w:t>Ingeniería en Computación e Informática</w:t>
-      </w:r>
-      <w:r>
-        <w:rPr>
-          <w:rFonts w:cstheme="minorHAnsi"/>
-          <w:sz w:val="18"/>
-          <w:szCs w:val="18"/>
-        </w:rPr>
-        <w:t xml:space="preserve"> </w:t>
-      </w:r>
-      <w:r>
-        <w:rPr>
-          <w:rFonts w:cstheme="minorHAnsi"/>
-          <w:sz w:val="18"/>
-          <w:szCs w:val="18"/>
-        </w:rPr>
-        <w:t>(2022–2026)</w:t>
+        <w:t>Ingeniero en Computación e Informática – Titulado (2022 – 2026)</w:t>
       </w:r>
     </w:p>
     <w:p>
@@ -805,8 +996,41 @@
           <w:sz w:val="18"/>
           <w:szCs w:val="18"/>
         </w:rPr>
-        <w:t xml:space="preserve">, </w:t>
-      </w:r>
+        <w:t>,</w:t>
+      </w:r>
+      <w:r>
+        <w:rPr>
+          <w:rFonts w:cstheme="minorHAnsi"/>
+          <w:sz w:val="18"/>
+          <w:szCs w:val="18"/>
+        </w:rPr>
+        <w:t xml:space="preserve"> </w:t>
+      </w:r>
+      <w:r>
+        <w:rPr>
+          <w:rFonts w:cstheme="minorHAnsi"/>
+          <w:sz w:val="18"/>
+          <w:szCs w:val="18"/>
+        </w:rPr>
+        <w:t>C#</w:t>
+      </w:r>
+      <w:r>
+        <w:rPr>
+          <w:rFonts w:cstheme="minorHAnsi"/>
+          <w:sz w:val="18"/>
+          <w:szCs w:val="18"/>
+        </w:rPr>
+        <w:t>,</w:t>
+      </w:r>
+      <w:r>
+        <w:rPr>
+          <w:rFonts w:cstheme="minorHAnsi"/>
+          <w:sz w:val="18"/>
+          <w:szCs w:val="18"/>
+        </w:rPr>
+        <w:t xml:space="preserve"> </w:t>
+      </w:r>
+      <w:proofErr w:type="spellStart"/>
       <w:r>
         <w:rPr>
           <w:rFonts w:cstheme="minorHAnsi"/>
@@ -815,13 +1039,14 @@
         </w:rPr>
         <w:t>Kotlin</w:t>
       </w:r>
-      <w:r>
-        <w:rPr>
-          <w:rFonts w:cstheme="minorHAnsi"/>
-          <w:sz w:val="18"/>
-          <w:szCs w:val="18"/>
-        </w:rPr>
-        <w:t>.</w:t>
+      <w:proofErr w:type="spellEnd"/>
+      <w:r>
+        <w:rPr>
+          <w:rFonts w:cstheme="minorHAnsi"/>
+          <w:sz w:val="18"/>
+          <w:szCs w:val="18"/>
+        </w:rPr>
+        <w:t>, Java</w:t>
       </w:r>
     </w:p>
     <w:p>
@@ -838,13 +1063,59 @@
           <w:szCs w:val="18"/>
         </w:rPr>
       </w:pPr>
-      <w:r>
-        <w:rPr>
-          <w:rFonts w:cstheme="minorHAnsi"/>
-          <w:sz w:val="18"/>
-          <w:szCs w:val="18"/>
-        </w:rPr>
-        <w:t>Frontend: React, HTML, CSS, TailwindCSS.</w:t>
+      <w:proofErr w:type="spellStart"/>
+      <w:r>
+        <w:rPr>
+          <w:rFonts w:cstheme="minorHAnsi"/>
+          <w:sz w:val="18"/>
+          <w:szCs w:val="18"/>
+        </w:rPr>
+        <w:t>Frontend</w:t>
+      </w:r>
+      <w:proofErr w:type="spellEnd"/>
+      <w:r>
+        <w:rPr>
+          <w:rFonts w:cstheme="minorHAnsi"/>
+          <w:sz w:val="18"/>
+          <w:szCs w:val="18"/>
+        </w:rPr>
+        <w:t xml:space="preserve">: </w:t>
+      </w:r>
+      <w:proofErr w:type="spellStart"/>
+      <w:r>
+        <w:rPr>
+          <w:rFonts w:cstheme="minorHAnsi"/>
+          <w:sz w:val="18"/>
+          <w:szCs w:val="18"/>
+        </w:rPr>
+        <w:t>React</w:t>
+      </w:r>
+      <w:proofErr w:type="spellEnd"/>
+      <w:r>
+        <w:rPr>
+          <w:rFonts w:cstheme="minorHAnsi"/>
+          <w:sz w:val="18"/>
+          <w:szCs w:val="18"/>
+        </w:rPr>
+        <w:t xml:space="preserve">, HTML, CSS, </w:t>
+      </w:r>
+      <w:proofErr w:type="spellStart"/>
+      <w:r>
+        <w:rPr>
+          <w:rFonts w:cstheme="minorHAnsi"/>
+          <w:sz w:val="18"/>
+          <w:szCs w:val="18"/>
+        </w:rPr>
+        <w:t>TailwindCSS</w:t>
+      </w:r>
+      <w:proofErr w:type="spellEnd"/>
+      <w:r>
+        <w:rPr>
+          <w:rFonts w:cstheme="minorHAnsi"/>
+          <w:sz w:val="18"/>
+          <w:szCs w:val="18"/>
+        </w:rPr>
+        <w:t>.</w:t>
       </w:r>
     </w:p>
     <w:p>
@@ -861,13 +1132,39 @@
           <w:szCs w:val="18"/>
         </w:rPr>
       </w:pPr>
-      <w:r>
-        <w:rPr>
-          <w:rFonts w:cstheme="minorHAnsi"/>
-          <w:sz w:val="18"/>
-          <w:szCs w:val="18"/>
-        </w:rPr>
-        <w:t>Backend: Node.js, REST API, JWT.</w:t>
+      <w:proofErr w:type="spellStart"/>
+      <w:r>
+        <w:rPr>
+          <w:rFonts w:cstheme="minorHAnsi"/>
+          <w:sz w:val="18"/>
+          <w:szCs w:val="18"/>
+        </w:rPr>
+        <w:t>Backend</w:t>
+      </w:r>
+      <w:proofErr w:type="spellEnd"/>
+      <w:r>
+        <w:rPr>
+          <w:rFonts w:cstheme="minorHAnsi"/>
+          <w:sz w:val="18"/>
+          <w:szCs w:val="18"/>
+        </w:rPr>
+        <w:t>: Node.js,</w:t>
+      </w:r>
+      <w:r>
+        <w:rPr>
+          <w:rFonts w:cstheme="minorHAnsi"/>
+          <w:sz w:val="18"/>
+          <w:szCs w:val="18"/>
+        </w:rPr>
+        <w:t xml:space="preserve"> .NET,</w:t>
+      </w:r>
+      <w:r>
+        <w:rPr>
+          <w:rFonts w:cstheme="minorHAnsi"/>
+          <w:sz w:val="18"/>
+          <w:szCs w:val="18"/>
+        </w:rPr>
+        <w:t xml:space="preserve"> REST API, JWT.</w:t>
       </w:r>
     </w:p>
     <w:p>
@@ -890,7 +1187,25 @@
           <w:sz w:val="18"/>
           <w:szCs w:val="18"/>
         </w:rPr>
-        <w:t>Mobile: Android, MVVM, Room, Retrofit.</w:t>
+        <w:t xml:space="preserve">Mobile: Android, MVVM, Room, </w:t>
+      </w:r>
+      <w:proofErr w:type="spellStart"/>
+      <w:r>
+        <w:rPr>
+          <w:rFonts w:cstheme="minorHAnsi"/>
+          <w:sz w:val="18"/>
+          <w:szCs w:val="18"/>
+        </w:rPr>
+        <w:t>Retrofit</w:t>
+      </w:r>
+      <w:proofErr w:type="spellEnd"/>
+      <w:r>
+        <w:rPr>
+          <w:rFonts w:cstheme="minorHAnsi"/>
+          <w:sz w:val="18"/>
+          <w:szCs w:val="18"/>
+        </w:rPr>
+        <w:t>.</w:t>
       </w:r>
     </w:p>
     <w:p>
@@ -968,8 +1283,36 @@
           <w:sz w:val="18"/>
           <w:szCs w:val="18"/>
         </w:rPr>
-        <w:t>Git (GitHub y GitLab) – GitFlow</w:t>
-      </w:r>
+        <w:t xml:space="preserve">Git (GitHub y </w:t>
+      </w:r>
+      <w:proofErr w:type="spellStart"/>
+      <w:r>
+        <w:rPr>
+          <w:rFonts w:cstheme="minorHAnsi"/>
+          <w:sz w:val="18"/>
+          <w:szCs w:val="18"/>
+        </w:rPr>
+        <w:t>GitLab</w:t>
+      </w:r>
+      <w:proofErr w:type="spellEnd"/>
+      <w:r>
+        <w:rPr>
+          <w:rFonts w:cstheme="minorHAnsi"/>
+          <w:sz w:val="18"/>
+          <w:szCs w:val="18"/>
+        </w:rPr>
+        <w:t xml:space="preserve">) – </w:t>
+      </w:r>
+      <w:proofErr w:type="spellStart"/>
+      <w:r>
+        <w:rPr>
+          <w:rFonts w:cstheme="minorHAnsi"/>
+          <w:sz w:val="18"/>
+          <w:szCs w:val="18"/>
+        </w:rPr>
+        <w:t>GitFlow</w:t>
+      </w:r>
+      <w:proofErr w:type="spellEnd"/>
     </w:p>
     <w:p>
       <w:pPr>
@@ -1079,11 +1422,13 @@
     <w:p>
       <w:pPr>
         <w:pStyle w:val="Sinespaciado"/>
+        <w:pBdr>
+          <w:bottom w:val="single" w:sz="12" w:space="1" w:color="auto"/>
+        </w:pBdr>
         <w:jc w:val="both"/>
         <w:rPr>
           <w:rFonts w:cstheme="minorHAnsi"/>
           <w:b/>
-          <w:bCs/>
           <w:sz w:val="18"/>
           <w:szCs w:val="18"/>
         </w:rPr>
@@ -1092,11 +1437,19 @@
         <w:rPr>
           <w:rFonts w:cstheme="minorHAnsi"/>
           <w:b/>
-          <w:bCs/>
           <w:sz w:val="18"/>
           <w:szCs w:val="18"/>
         </w:rPr>
         <w:t>PROYECTOS DESTACADOS</w:t>
+      </w:r>
+      <w:r>
+        <w:rPr>
+          <w:rFonts w:cstheme="minorHAnsi"/>
+          <w:b/>
+          <w:sz w:val="18"/>
+          <w:szCs w:val="18"/>
+        </w:rPr>
+        <w:t xml:space="preserve"> </w:t>
       </w:r>
     </w:p>
     <w:p>
@@ -1119,7 +1472,25 @@
           <w:sz w:val="18"/>
           <w:szCs w:val="18"/>
         </w:rPr>
-        <w:t>Plataforma de adopción de mascotas | React – Node.js – MongoDB</w:t>
+        <w:t xml:space="preserve">Plataforma de adopción de mascotas | </w:t>
+      </w:r>
+      <w:proofErr w:type="spellStart"/>
+      <w:r>
+        <w:rPr>
+          <w:rFonts w:cstheme="minorHAnsi"/>
+          <w:sz w:val="18"/>
+          <w:szCs w:val="18"/>
+        </w:rPr>
+        <w:t>React</w:t>
+      </w:r>
+      <w:proofErr w:type="spellEnd"/>
+      <w:r>
+        <w:rPr>
+          <w:rFonts w:cstheme="minorHAnsi"/>
+          <w:sz w:val="18"/>
+          <w:szCs w:val="18"/>
+        </w:rPr>
+        <w:t xml:space="preserve"> – Node.js – MongoDB</w:t>
       </w:r>
       <w:r>
         <w:rPr>
@@ -1186,7 +1557,25 @@
           <w:sz w:val="18"/>
           <w:szCs w:val="18"/>
         </w:rPr>
-        <w:t xml:space="preserve">Red de servicios de profesionales | React – Node.js – PostgreSQL – </w:t>
+        <w:t xml:space="preserve">Red de servicios de profesionales | </w:t>
+      </w:r>
+      <w:proofErr w:type="spellStart"/>
+      <w:r>
+        <w:rPr>
+          <w:rFonts w:cstheme="minorHAnsi"/>
+          <w:sz w:val="18"/>
+          <w:szCs w:val="18"/>
+        </w:rPr>
+        <w:t>React</w:t>
+      </w:r>
+      <w:proofErr w:type="spellEnd"/>
+      <w:r>
+        <w:rPr>
+          <w:rFonts w:cstheme="minorHAnsi"/>
+          <w:sz w:val="18"/>
+          <w:szCs w:val="18"/>
+        </w:rPr>
+        <w:t xml:space="preserve"> – Node.js – PostgreSQL – </w:t>
       </w:r>
       <w:r>
         <w:rPr>
@@ -1253,7 +1642,25 @@
           <w:sz w:val="18"/>
           <w:szCs w:val="18"/>
         </w:rPr>
-        <w:t>Sistema de biblioteca digital | React – Node.js</w:t>
+        <w:t xml:space="preserve">Sistema de biblioteca digital | </w:t>
+      </w:r>
+      <w:proofErr w:type="spellStart"/>
+      <w:r>
+        <w:rPr>
+          <w:rFonts w:cstheme="minorHAnsi"/>
+          <w:sz w:val="18"/>
+          <w:szCs w:val="18"/>
+        </w:rPr>
+        <w:t>React</w:t>
+      </w:r>
+      <w:proofErr w:type="spellEnd"/>
+      <w:r>
+        <w:rPr>
+          <w:rFonts w:cstheme="minorHAnsi"/>
+          <w:sz w:val="18"/>
+          <w:szCs w:val="18"/>
+        </w:rPr>
+        <w:t xml:space="preserve"> – Node.js</w:t>
       </w:r>
       <w:r>
         <w:rPr>

</xml_diff>